<commit_message>
doc updates, full, submitted (removed giant video)
</commit_message>
<xml_diff>
--- a/docs/gemspot_training_report_newip.docx
+++ b/docs/gemspot_training_report_newip.docx
@@ -88,38 +88,7 @@
         </w:r>
       </w:hyperlink>
       <w:r>
-        <w:t xml:space="preserve"> Experiment: </w:t>
-      </w:r>
-      <w:proofErr w:type="spellStart"/>
-      <w:r>
-        <w:rPr>
-          <w:b/>
-          <w:bCs/>
-        </w:rPr>
-        <w:t>GemSpot-</w:t>
-      </w:r>
-      <w:proofErr w:type="gramStart"/>
-      <w:r>
-        <w:rPr>
-          <w:b/>
-          <w:bCs/>
-        </w:rPr>
-        <w:t>WillVisit</w:t>
-      </w:r>
-      <w:proofErr w:type="spellEnd"/>
-      <w:r>
-        <w:rPr>
-          <w:b/>
-          <w:bCs/>
-        </w:rPr>
-        <w:t xml:space="preserve">  </w:t>
-      </w:r>
-      <w:r>
-        <w:t>Active</w:t>
-      </w:r>
-      <w:proofErr w:type="gramEnd"/>
-      <w:r>
-        <w:t xml:space="preserve"> until: April 10, 2026</w:t>
+        <w:t xml:space="preserve"> </w:t>
       </w:r>
     </w:p>
     <w:p>
@@ -1850,7 +1819,7 @@
 <w:hdr xmlns:wpc="http://schemas.microsoft.com/office/word/2010/wordprocessingCanvas" xmlns:cx="http://schemas.microsoft.com/office/drawing/2014/chartex" xmlns:cx1="http://schemas.microsoft.com/office/drawing/2015/9/8/chartex" xmlns:cx2="http://schemas.microsoft.com/office/drawing/2015/10/21/chartex" xmlns:cx3="http://schemas.microsoft.com/office/drawing/2016/5/9/chartex" xmlns:cx4="http://schemas.microsoft.com/office/drawing/2016/5/10/chartex" xmlns:cx5="http://schemas.microsoft.com/office/drawing/2016/5/11/chartex" xmlns:cx6="http://schemas.microsoft.com/office/drawing/2016/5/12/chartex" xmlns:cx7="http://schemas.microsoft.com/office/drawing/2016/5/13/chartex" xmlns:cx8="http://schemas.microsoft.com/office/drawing/2016/5/14/chartex" xmlns:mc="http://schemas.openxmlformats.org/markup-compatibility/2006" xmlns:aink="http://schemas.microsoft.com/office/drawing/2016/ink" xmlns:am3d="http://schemas.microsoft.com/office/drawing/2017/model3d" xmlns:o="urn:schemas-microsoft-com:office:office" xmlns:oel="http://schemas.microsoft.com/office/2019/extlst" xmlns:r="http://schemas.openxmlformats.org/officeDocument/2006/relationships" xmlns:m="http://schemas.openxmlformats.org/officeDocument/2006/math" xmlns:v="urn:schemas-microsoft-com:vml" xmlns:wp14="http://schemas.microsoft.com/office/word/2010/wordprocessingDrawing" xmlns:wp="http://schemas.openxmlformats.org/drawingml/2006/wordprocessingDrawing" xmlns:w10="urn:schemas-microsoft-com:office:word" xmlns:w="http://schemas.openxmlformats.org/wordprocessingml/2006/main" xmlns:w14="http://schemas.microsoft.com/office/word/2010/wordml" xmlns:w15="http://schemas.microsoft.com/office/word/2012/wordml" xmlns:w16cex="http://schemas.microsoft.com/office/word/2018/wordml/cex" xmlns:w16cid="http://schemas.microsoft.com/office/word/2016/wordml/cid" xmlns:w16="http://schemas.microsoft.com/office/word/2018/wordml" xmlns:w16du="http://schemas.microsoft.com/office/word/2023/wordml/word16du" xmlns:w16sdtdh="http://schemas.microsoft.com/office/word/2020/wordml/sdtdatahash" xmlns:w16sdtfl="http://schemas.microsoft.com/office/word/2024/wordml/sdtformatlock" xmlns:w16se="http://schemas.microsoft.com/office/word/2015/wordml/symex" xmlns:wpg="http://schemas.microsoft.com/office/word/2010/wordprocessingGroup" xmlns:wpi="http://schemas.microsoft.com/office/word/2010/wordprocessingInk" xmlns:wne="http://schemas.microsoft.com/office/word/2006/wordml" xmlns:wps="http://schemas.microsoft.com/office/word/2010/wordprocessingShape" mc:Ignorable="w14 w15 w16se w16cid w16 w16cex w16sdtdh w16sdtfl w16du wp14">
   <w:p>
     <w:pPr>
-      <w:jc w:val="right"/>
+      <w:jc w:val="center"/>
       <w:rPr>
         <w:i/>
         <w:iCs/>
@@ -1859,38 +1828,6 @@
         <w:szCs w:val="16"/>
       </w:rPr>
     </w:pPr>
-    <w:proofErr w:type="spellStart"/>
-    <w:r>
-      <w:rPr>
-        <w:i/>
-        <w:iCs/>
-        <w:color w:val="888888"/>
-        <w:sz w:val="16"/>
-        <w:szCs w:val="16"/>
-      </w:rPr>
-      <w:t>GemSpot</w:t>
-    </w:r>
-    <w:proofErr w:type="spellEnd"/>
-    <w:r>
-      <w:rPr>
-        <w:i/>
-        <w:iCs/>
-        <w:color w:val="888888"/>
-        <w:sz w:val="16"/>
-        <w:szCs w:val="16"/>
-      </w:rPr>
-      <w:t xml:space="preserve"> Training Report | </w:t>
-    </w:r>
-    <w:r>
-      <w:rPr>
-        <w:i/>
-        <w:iCs/>
-        <w:color w:val="888888"/>
-        <w:sz w:val="16"/>
-        <w:szCs w:val="16"/>
-      </w:rPr>
-      <w:t>proj10</w:t>
-    </w:r>
   </w:p>
 </w:hdr>
 </file>

</xml_diff>

<commit_message>
updated docs working 4 models
</commit_message>
<xml_diff>
--- a/docs/gemspot_training_report_newip.docx
+++ b/docs/gemspot_training_report_newip.docx
@@ -117,13 +117,13 @@
         <w:tblLook w:val="04A0" w:firstRow="1" w:lastRow="0" w:firstColumn="1" w:lastColumn="0" w:noHBand="0" w:noVBand="1"/>
       </w:tblPr>
       <w:tblGrid>
-        <w:gridCol w:w="1162"/>
-        <w:gridCol w:w="1591"/>
-        <w:gridCol w:w="1116"/>
-        <w:gridCol w:w="2179"/>
-        <w:gridCol w:w="2789"/>
-        <w:gridCol w:w="1789"/>
-        <w:gridCol w:w="3774"/>
+        <w:gridCol w:w="2151"/>
+        <w:gridCol w:w="1431"/>
+        <w:gridCol w:w="1058"/>
+        <w:gridCol w:w="2133"/>
+        <w:gridCol w:w="2600"/>
+        <w:gridCol w:w="1607"/>
+        <w:gridCol w:w="3420"/>
       </w:tblGrid>
       <w:tr>
         <w:tblPrEx>
@@ -450,30 +450,302 @@
             </w:tcMar>
           </w:tcPr>
           <w:p>
-            <w:hyperlink r:id="rId8" w:anchor="/experiments/1/runs/aa842f80d7bf467cab905af279171869" w:history="1">
+            <w:hyperlink r:id="rId8" w:anchor="/experiments/1/runs/b529c9727ab04722aa08f9510d9712b5" w:tgtFrame="_blank" w:history="1">
               <w:r>
                 <w:rPr>
                   <w:rStyle w:val="Hyperlink"/>
                   <w:sz w:val="16"/>
                   <w:szCs w:val="16"/>
                 </w:rPr>
-                <w:t>Run L</w:t>
+                <w:t>Run Link</w:t>
               </w:r>
+            </w:hyperlink>
+          </w:p>
+        </w:tc>
+        <w:tc>
+          <w:tcPr>
+            <w:tcW w:w="1116" w:type="dxa"/>
+            <w:tcBorders>
+              <w:top w:val="single" w:sz="1" w:space="0" w:color="999999"/>
+              <w:left w:val="single" w:sz="1" w:space="0" w:color="999999"/>
+              <w:bottom w:val="single" w:sz="1" w:space="0" w:color="999999"/>
+              <w:right w:val="single" w:sz="1" w:space="0" w:color="999999"/>
+            </w:tcBorders>
+            <w:tcMar>
+              <w:top w:w="60" w:type="dxa"/>
+              <w:left w:w="80" w:type="dxa"/>
+              <w:bottom w:w="60" w:type="dxa"/>
+              <w:right w:w="80" w:type="dxa"/>
+            </w:tcMar>
+          </w:tcPr>
+          <w:p>
+            <w:pPr>
+              <w:jc w:val="center"/>
+            </w:pPr>
+            <w:r>
+              <w:rPr>
+                <w:sz w:val="18"/>
+                <w:szCs w:val="18"/>
+              </w:rPr>
+              <w:t>0</w:t>
+            </w:r>
+          </w:p>
+        </w:tc>
+        <w:tc>
+          <w:tcPr>
+            <w:tcW w:w="2179" w:type="dxa"/>
+            <w:tcBorders>
+              <w:top w:val="single" w:sz="1" w:space="0" w:color="999999"/>
+              <w:left w:val="single" w:sz="1" w:space="0" w:color="999999"/>
+              <w:bottom w:val="single" w:sz="1" w:space="0" w:color="999999"/>
+              <w:right w:val="single" w:sz="1" w:space="0" w:color="999999"/>
+            </w:tcBorders>
+            <w:tcMar>
+              <w:top w:w="60" w:type="dxa"/>
+              <w:left w:w="80" w:type="dxa"/>
+              <w:bottom w:w="60" w:type="dxa"/>
+              <w:right w:w="80" w:type="dxa"/>
+            </w:tcMar>
+          </w:tcPr>
+          <w:p>
+            <w:r>
+              <w:rPr>
+                <w:sz w:val="18"/>
+                <w:szCs w:val="18"/>
+              </w:rPr>
+              <w:t xml:space="preserve">strategy= </w:t>
+            </w:r>
+            <w:proofErr w:type="spellStart"/>
+            <w:r>
+              <w:rPr>
+                <w:sz w:val="18"/>
+                <w:szCs w:val="18"/>
+              </w:rPr>
+              <w:t>most_frequent</w:t>
+            </w:r>
+            <w:proofErr w:type="spellEnd"/>
+            <w:r>
+              <w:rPr>
+                <w:sz w:val="18"/>
+                <w:szCs w:val="18"/>
+              </w:rPr>
+              <w:t xml:space="preserve"> (</w:t>
+            </w:r>
+            <w:proofErr w:type="spellStart"/>
+            <w:r>
+              <w:rPr>
+                <w:sz w:val="18"/>
+                <w:szCs w:val="18"/>
+              </w:rPr>
+              <w:t>DummyClassifier</w:t>
+            </w:r>
+            <w:proofErr w:type="spellEnd"/>
+            <w:r>
+              <w:rPr>
+                <w:sz w:val="18"/>
+                <w:szCs w:val="18"/>
+              </w:rPr>
+              <w:t>)</w:t>
+            </w:r>
+          </w:p>
+        </w:tc>
+        <w:tc>
+          <w:tcPr>
+            <w:tcW w:w="2789" w:type="dxa"/>
+            <w:tcBorders>
+              <w:top w:val="single" w:sz="1" w:space="0" w:color="999999"/>
+              <w:left w:val="single" w:sz="1" w:space="0" w:color="999999"/>
+              <w:bottom w:val="single" w:sz="1" w:space="0" w:color="999999"/>
+              <w:right w:val="single" w:sz="1" w:space="0" w:color="999999"/>
+            </w:tcBorders>
+            <w:tcMar>
+              <w:top w:w="60" w:type="dxa"/>
+              <w:left w:w="80" w:type="dxa"/>
+              <w:bottom w:w="60" w:type="dxa"/>
+              <w:right w:w="80" w:type="dxa"/>
+            </w:tcMar>
+          </w:tcPr>
+          <w:p>
+            <w:r>
+              <w:rPr>
+                <w:sz w:val="18"/>
+                <w:szCs w:val="18"/>
+              </w:rPr>
+              <w:t xml:space="preserve">accuracy=0.861, precision=0.861, recall=1.000, f1=0.925, </w:t>
+            </w:r>
+            <w:proofErr w:type="spellStart"/>
+            <w:r>
+              <w:rPr>
+                <w:sz w:val="18"/>
+                <w:szCs w:val="18"/>
+              </w:rPr>
+              <w:t>roc_auc</w:t>
+            </w:r>
+            <w:proofErr w:type="spellEnd"/>
+            <w:r>
+              <w:rPr>
+                <w:sz w:val="18"/>
+                <w:szCs w:val="18"/>
+              </w:rPr>
+              <w:t xml:space="preserve">=0.500, </w:t>
+            </w:r>
+            <w:proofErr w:type="spellStart"/>
+            <w:r>
+              <w:rPr>
+                <w:sz w:val="18"/>
+                <w:szCs w:val="18"/>
+              </w:rPr>
+              <w:t>avg_precision</w:t>
+            </w:r>
+            <w:proofErr w:type="spellEnd"/>
+            <w:r>
+              <w:rPr>
+                <w:sz w:val="18"/>
+                <w:szCs w:val="18"/>
+              </w:rPr>
+              <w:t>=0.861</w:t>
+            </w:r>
+          </w:p>
+        </w:tc>
+        <w:tc>
+          <w:tcPr>
+            <w:tcW w:w="1789" w:type="dxa"/>
+            <w:tcBorders>
+              <w:top w:val="single" w:sz="1" w:space="0" w:color="999999"/>
+              <w:left w:val="single" w:sz="1" w:space="0" w:color="999999"/>
+              <w:bottom w:val="single" w:sz="1" w:space="0" w:color="999999"/>
+              <w:right w:val="single" w:sz="1" w:space="0" w:color="999999"/>
+            </w:tcBorders>
+            <w:tcMar>
+              <w:top w:w="60" w:type="dxa"/>
+              <w:left w:w="80" w:type="dxa"/>
+              <w:bottom w:w="60" w:type="dxa"/>
+              <w:right w:w="80" w:type="dxa"/>
+            </w:tcMar>
+          </w:tcPr>
+          <w:p>
+            <w:r>
+              <w:rPr>
+                <w:sz w:val="18"/>
+                <w:szCs w:val="18"/>
+              </w:rPr>
+              <w:t>train: 5.6s, rows: 349,999, 62,775 rows/s</w:t>
+            </w:r>
+          </w:p>
+        </w:tc>
+        <w:tc>
+          <w:tcPr>
+            <w:tcW w:w="3774" w:type="dxa"/>
+            <w:tcBorders>
+              <w:top w:val="single" w:sz="1" w:space="0" w:color="999999"/>
+              <w:left w:val="single" w:sz="1" w:space="0" w:color="999999"/>
+              <w:bottom w:val="single" w:sz="1" w:space="0" w:color="999999"/>
+              <w:right w:val="single" w:sz="1" w:space="0" w:color="999999"/>
+            </w:tcBorders>
+            <w:tcMar>
+              <w:top w:w="60" w:type="dxa"/>
+              <w:left w:w="80" w:type="dxa"/>
+              <w:bottom w:w="60" w:type="dxa"/>
+              <w:right w:w="80" w:type="dxa"/>
+            </w:tcMar>
+          </w:tcPr>
+          <w:p>
+            <w:r>
+              <w:rPr>
+                <w:sz w:val="18"/>
+                <w:szCs w:val="18"/>
+              </w:rPr>
+              <w:t>Establishes baseline. Always predicts majority class (</w:t>
+            </w:r>
+            <w:proofErr w:type="spellStart"/>
+            <w:r>
+              <w:rPr>
+                <w:sz w:val="18"/>
+                <w:szCs w:val="18"/>
+              </w:rPr>
+              <w:t>will_visit</w:t>
+            </w:r>
+            <w:proofErr w:type="spellEnd"/>
+            <w:r>
+              <w:rPr>
+                <w:sz w:val="18"/>
+                <w:szCs w:val="18"/>
+              </w:rPr>
+              <w:t xml:space="preserve">=1). ROC-AUC=0.5 confirms no discriminative power. </w:t>
+            </w:r>
+          </w:p>
+        </w:tc>
+      </w:tr>
+      <w:tr>
+        <w:tblPrEx>
+          <w:tblCellMar>
+            <w:top w:w="0" w:type="dxa"/>
+            <w:bottom w:w="0" w:type="dxa"/>
+          </w:tblCellMar>
+        </w:tblPrEx>
+        <w:tc>
+          <w:tcPr>
+            <w:tcW w:w="1162" w:type="dxa"/>
+            <w:tcBorders>
+              <w:top w:val="single" w:sz="1" w:space="0" w:color="999999"/>
+              <w:left w:val="single" w:sz="1" w:space="0" w:color="999999"/>
+              <w:bottom w:val="single" w:sz="1" w:space="0" w:color="999999"/>
+              <w:right w:val="single" w:sz="1" w:space="0" w:color="999999"/>
+            </w:tcBorders>
+            <w:tcMar>
+              <w:top w:w="60" w:type="dxa"/>
+              <w:left w:w="80" w:type="dxa"/>
+              <w:bottom w:w="60" w:type="dxa"/>
+              <w:right w:w="80" w:type="dxa"/>
+            </w:tcMar>
+          </w:tcPr>
+          <w:p>
+            <w:pPr>
+              <w:rPr>
+                <w:b/>
+                <w:bCs/>
+                <w:sz w:val="18"/>
+                <w:szCs w:val="18"/>
+              </w:rPr>
+            </w:pPr>
+            <w:proofErr w:type="spellStart"/>
+            <w:r>
+              <w:rPr>
+                <w:b/>
+                <w:bCs/>
+                <w:sz w:val="18"/>
+                <w:szCs w:val="18"/>
+              </w:rPr>
+              <w:t>hist_gradient_boosting</w:t>
+            </w:r>
+            <w:proofErr w:type="spellEnd"/>
+          </w:p>
+        </w:tc>
+        <w:tc>
+          <w:tcPr>
+            <w:tcW w:w="1591" w:type="dxa"/>
+            <w:tcBorders>
+              <w:top w:val="single" w:sz="1" w:space="0" w:color="999999"/>
+              <w:left w:val="single" w:sz="1" w:space="0" w:color="999999"/>
+              <w:bottom w:val="single" w:sz="1" w:space="0" w:color="999999"/>
+              <w:right w:val="single" w:sz="1" w:space="0" w:color="999999"/>
+            </w:tcBorders>
+            <w:tcMar>
+              <w:top w:w="60" w:type="dxa"/>
+              <w:left w:w="80" w:type="dxa"/>
+              <w:bottom w:w="60" w:type="dxa"/>
+              <w:right w:w="80" w:type="dxa"/>
+            </w:tcMar>
+          </w:tcPr>
+          <w:p>
+            <w:hyperlink r:id="rId9" w:anchor="/experiments/1/runs/9815aae2e9f447ef898ec00cc0758604" w:tgtFrame="_blank" w:history="1">
               <w:r>
                 <w:rPr>
                   <w:rStyle w:val="Hyperlink"/>
                   <w:sz w:val="16"/>
                   <w:szCs w:val="16"/>
                 </w:rPr>
-                <w:t>i</w:t>
-              </w:r>
-              <w:r>
-                <w:rPr>
-                  <w:rStyle w:val="Hyperlink"/>
-                  <w:sz w:val="16"/>
-                  <w:szCs w:val="16"/>
-                </w:rPr>
-                <w:t>n</w:t>
+                <w:t>Run Lin</w:t>
               </w:r>
               <w:r>
                 <w:rPr>
@@ -505,14 +777,11 @@
           <w:p>
             <w:pPr>
               <w:jc w:val="center"/>
+              <w:rPr>
+                <w:sz w:val="18"/>
+                <w:szCs w:val="18"/>
+              </w:rPr>
             </w:pPr>
-            <w:r>
-              <w:rPr>
-                <w:sz w:val="18"/>
-                <w:szCs w:val="18"/>
-              </w:rPr>
-              <w:t>0</w:t>
-            </w:r>
           </w:p>
         </w:tc>
         <w:tc>
@@ -532,44 +801,75 @@
             </w:tcMar>
           </w:tcPr>
           <w:p>
-            <w:r>
-              <w:rPr>
-                <w:sz w:val="18"/>
-                <w:szCs w:val="18"/>
-              </w:rPr>
-              <w:t xml:space="preserve">strategy= </w:t>
-            </w:r>
-            <w:proofErr w:type="spellStart"/>
-            <w:r>
-              <w:rPr>
-                <w:sz w:val="18"/>
-                <w:szCs w:val="18"/>
-              </w:rPr>
-              <w:t>most_frequent</w:t>
-            </w:r>
-            <w:proofErr w:type="spellEnd"/>
-            <w:r>
-              <w:rPr>
-                <w:sz w:val="18"/>
-                <w:szCs w:val="18"/>
-              </w:rPr>
-              <w:t xml:space="preserve"> (</w:t>
-            </w:r>
-            <w:proofErr w:type="spellStart"/>
-            <w:r>
-              <w:rPr>
-                <w:sz w:val="18"/>
-                <w:szCs w:val="18"/>
-              </w:rPr>
-              <w:t>DummyClassifier</w:t>
-            </w:r>
-            <w:proofErr w:type="spellEnd"/>
-            <w:r>
-              <w:rPr>
-                <w:sz w:val="18"/>
-                <w:szCs w:val="18"/>
-              </w:rPr>
-              <w:t>)</w:t>
+            <w:pPr>
+              <w:rPr>
+                <w:sz w:val="18"/>
+                <w:szCs w:val="18"/>
+              </w:rPr>
+            </w:pPr>
+            <w:proofErr w:type="spellStart"/>
+            <w:r>
+              <w:rPr>
+                <w:sz w:val="18"/>
+                <w:szCs w:val="18"/>
+              </w:rPr>
+              <w:t>learning_rate</w:t>
+            </w:r>
+            <w:proofErr w:type="spellEnd"/>
+            <w:r>
+              <w:rPr>
+                <w:sz w:val="18"/>
+                <w:szCs w:val="18"/>
+              </w:rPr>
+              <w:t xml:space="preserve">=0.1, </w:t>
+            </w:r>
+            <w:proofErr w:type="spellStart"/>
+            <w:r>
+              <w:rPr>
+                <w:sz w:val="18"/>
+                <w:szCs w:val="18"/>
+              </w:rPr>
+              <w:t>max_iter</w:t>
+            </w:r>
+            <w:proofErr w:type="spellEnd"/>
+            <w:r>
+              <w:rPr>
+                <w:sz w:val="18"/>
+                <w:szCs w:val="18"/>
+              </w:rPr>
+              <w:t xml:space="preserve">=100, </w:t>
+            </w:r>
+            <w:proofErr w:type="spellStart"/>
+            <w:r>
+              <w:rPr>
+                <w:sz w:val="18"/>
+                <w:szCs w:val="18"/>
+              </w:rPr>
+              <w:t>max_depth</w:t>
+            </w:r>
+            <w:proofErr w:type="spellEnd"/>
+            <w:r>
+              <w:rPr>
+                <w:sz w:val="18"/>
+                <w:szCs w:val="18"/>
+              </w:rPr>
+              <w:t xml:space="preserve">=6, </w:t>
+            </w:r>
+            <w:proofErr w:type="spellStart"/>
+            <w:r>
+              <w:rPr>
+                <w:sz w:val="18"/>
+                <w:szCs w:val="18"/>
+              </w:rPr>
+              <w:t>min_samples_leaf</w:t>
+            </w:r>
+            <w:proofErr w:type="spellEnd"/>
+            <w:r>
+              <w:rPr>
+                <w:sz w:val="18"/>
+                <w:szCs w:val="18"/>
+              </w:rPr>
+              <w:t>=20</w:t>
             </w:r>
           </w:p>
         </w:tc>
@@ -590,42 +890,19 @@
             </w:tcMar>
           </w:tcPr>
           <w:p>
-            <w:r>
-              <w:rPr>
-                <w:sz w:val="18"/>
-                <w:szCs w:val="18"/>
-              </w:rPr>
-              <w:t>accuracy=0.861</w:t>
-            </w:r>
-          </w:p>
-          <w:p>
-            <w:r>
-              <w:rPr>
-                <w:sz w:val="18"/>
-                <w:szCs w:val="18"/>
-              </w:rPr>
-              <w:t>precision=0.861</w:t>
-            </w:r>
-          </w:p>
-          <w:p>
-            <w:r>
-              <w:rPr>
-                <w:sz w:val="18"/>
-                <w:szCs w:val="18"/>
-              </w:rPr>
-              <w:t>recall=1.000</w:t>
-            </w:r>
-          </w:p>
-          <w:p>
-            <w:r>
-              <w:rPr>
-                <w:sz w:val="18"/>
-                <w:szCs w:val="18"/>
-              </w:rPr>
-              <w:t>f1=0.925</w:t>
-            </w:r>
-          </w:p>
-          <w:p>
+            <w:pPr>
+              <w:rPr>
+                <w:sz w:val="18"/>
+                <w:szCs w:val="18"/>
+              </w:rPr>
+            </w:pPr>
+            <w:r>
+              <w:rPr>
+                <w:sz w:val="18"/>
+                <w:szCs w:val="18"/>
+              </w:rPr>
+              <w:t xml:space="preserve">accuracy=0.871, precision=0.877, recall=0.988, f1=0.929, </w:t>
+            </w:r>
             <w:proofErr w:type="spellStart"/>
             <w:r>
               <w:rPr>
@@ -640,10 +917,8 @@
                 <w:sz w:val="18"/>
                 <w:szCs w:val="18"/>
               </w:rPr>
-              <w:t>=0.500</w:t>
-            </w:r>
-          </w:p>
-          <w:p>
+              <w:t xml:space="preserve">=0.796, </w:t>
+            </w:r>
             <w:proofErr w:type="spellStart"/>
             <w:r>
               <w:rPr>
@@ -658,7 +933,7 @@
                 <w:sz w:val="18"/>
                 <w:szCs w:val="18"/>
               </w:rPr>
-              <w:t>=0.861</w:t>
+              <w:t>=0.958</w:t>
             </w:r>
           </w:p>
         </w:tc>
@@ -679,58 +954,18 @@
             </w:tcMar>
           </w:tcPr>
           <w:p>
-            <w:r>
-              <w:rPr>
-                <w:sz w:val="18"/>
-                <w:szCs w:val="18"/>
-              </w:rPr>
-              <w:t xml:space="preserve">train: </w:t>
-            </w:r>
-            <w:r>
-              <w:rPr>
-                <w:sz w:val="18"/>
-                <w:szCs w:val="18"/>
-              </w:rPr>
-              <w:t>12</w:t>
-            </w:r>
-            <w:r>
-              <w:rPr>
-                <w:sz w:val="18"/>
-                <w:szCs w:val="18"/>
-              </w:rPr>
-              <w:t>.</w:t>
-            </w:r>
-            <w:r>
-              <w:rPr>
-                <w:sz w:val="18"/>
-                <w:szCs w:val="18"/>
-              </w:rPr>
-              <w:t>1</w:t>
-            </w:r>
-            <w:r>
-              <w:rPr>
-                <w:sz w:val="18"/>
-                <w:szCs w:val="18"/>
-              </w:rPr>
-              <w:t>s</w:t>
-            </w:r>
-          </w:p>
-          <w:p>
-            <w:r>
-              <w:rPr>
-                <w:sz w:val="18"/>
-                <w:szCs w:val="18"/>
-              </w:rPr>
-              <w:t>rows: 349,999</w:t>
-            </w:r>
-          </w:p>
-          <w:p>
-            <w:r>
-              <w:rPr>
-                <w:sz w:val="18"/>
-                <w:szCs w:val="18"/>
-              </w:rPr>
-              <w:t>65,150 rows/s</w:t>
+            <w:pPr>
+              <w:rPr>
+                <w:sz w:val="18"/>
+                <w:szCs w:val="18"/>
+              </w:rPr>
+            </w:pPr>
+            <w:r>
+              <w:rPr>
+                <w:sz w:val="18"/>
+                <w:szCs w:val="18"/>
+              </w:rPr>
+              <w:t>train: 20.4s, rows: 349,999, 17,158 rows/s</w:t>
             </w:r>
           </w:p>
         </w:tc>
@@ -751,28 +986,43 @@
             </w:tcMar>
           </w:tcPr>
           <w:p>
-            <w:r>
-              <w:rPr>
-                <w:sz w:val="18"/>
-                <w:szCs w:val="18"/>
-              </w:rPr>
-              <w:t>Establishes baseline. Always predicts majority class (</w:t>
-            </w:r>
-            <w:proofErr w:type="spellStart"/>
-            <w:r>
-              <w:rPr>
-                <w:sz w:val="18"/>
-                <w:szCs w:val="18"/>
-              </w:rPr>
-              <w:t>will_visit</w:t>
-            </w:r>
-            <w:proofErr w:type="spellEnd"/>
-            <w:r>
-              <w:rPr>
-                <w:sz w:val="18"/>
-                <w:szCs w:val="18"/>
-              </w:rPr>
-              <w:t>=1). ROC-AUC=0.5 confirms no discriminative power. Every real model must beat this.</w:t>
+            <w:pPr>
+              <w:rPr>
+                <w:sz w:val="18"/>
+                <w:szCs w:val="18"/>
+              </w:rPr>
+            </w:pPr>
+            <w:proofErr w:type="spellStart"/>
+            <w:r>
+              <w:rPr>
+                <w:sz w:val="18"/>
+                <w:szCs w:val="18"/>
+              </w:rPr>
+              <w:t>Sklearn</w:t>
+            </w:r>
+            <w:proofErr w:type="spellEnd"/>
+            <w:r>
+              <w:rPr>
+                <w:sz w:val="18"/>
+                <w:szCs w:val="18"/>
+              </w:rPr>
+              <w:t xml:space="preserve"> native histogram-based gradient boosting. Comparable ROC-AUC to </w:t>
+            </w:r>
+            <w:proofErr w:type="spellStart"/>
+            <w:r>
+              <w:rPr>
+                <w:sz w:val="18"/>
+                <w:szCs w:val="18"/>
+              </w:rPr>
+              <w:t>XGBoost</w:t>
+            </w:r>
+            <w:proofErr w:type="spellEnd"/>
+            <w:r>
+              <w:rPr>
+                <w:sz w:val="18"/>
+                <w:szCs w:val="18"/>
+              </w:rPr>
+              <w:t xml:space="preserve"> (0.796 vs 0.795) but 47% slower. Validates that boosting approach works regardless of framework.</w:t>
             </w:r>
           </w:p>
         </w:tc>
@@ -829,30 +1079,14 @@
             </w:tcMar>
           </w:tcPr>
           <w:p>
-            <w:hyperlink r:id="rId9" w:anchor="/experiments/1/runs/6c81b5520608462c9edc375344d9a65a" w:history="1">
+            <w:hyperlink r:id="rId10" w:anchor="/experiments/1/runs/a300e7798a924d6694895a1b5752d2e4" w:tgtFrame="_blank" w:history="1">
               <w:r>
                 <w:rPr>
                   <w:rStyle w:val="Hyperlink"/>
                   <w:sz w:val="16"/>
                   <w:szCs w:val="16"/>
                 </w:rPr>
-                <w:t>Run Li</w:t>
-              </w:r>
-              <w:r>
-                <w:rPr>
-                  <w:rStyle w:val="Hyperlink"/>
-                  <w:sz w:val="16"/>
-                  <w:szCs w:val="16"/>
-                </w:rPr>
-                <w:t>n</w:t>
-              </w:r>
-              <w:r>
-                <w:rPr>
-                  <w:rStyle w:val="Hyperlink"/>
-                  <w:sz w:val="16"/>
-                  <w:szCs w:val="16"/>
-                </w:rPr>
-                <w:t>k</w:t>
+                <w:t>Run Link</w:t>
               </w:r>
             </w:hyperlink>
           </w:p>
@@ -917,10 +1151,8 @@
                 <w:sz w:val="18"/>
                 <w:szCs w:val="18"/>
               </w:rPr>
-              <w:t>=0.3</w:t>
-            </w:r>
-          </w:p>
-          <w:p>
+              <w:t xml:space="preserve">=0.3, </w:t>
+            </w:r>
             <w:proofErr w:type="spellStart"/>
             <w:r>
               <w:rPr>
@@ -935,10 +1167,8 @@
                 <w:sz w:val="18"/>
                 <w:szCs w:val="18"/>
               </w:rPr>
-              <w:t>=6</w:t>
-            </w:r>
-          </w:p>
-          <w:p>
+              <w:t xml:space="preserve">=6, </w:t>
+            </w:r>
             <w:proofErr w:type="spellStart"/>
             <w:r>
               <w:rPr>
@@ -953,10 +1183,8 @@
                 <w:sz w:val="18"/>
                 <w:szCs w:val="18"/>
               </w:rPr>
-              <w:t>=100</w:t>
-            </w:r>
-          </w:p>
-          <w:p>
+              <w:t xml:space="preserve">=100, </w:t>
+            </w:r>
             <w:proofErr w:type="spellStart"/>
             <w:r>
               <w:rPr>
@@ -997,35 +1225,7 @@
                 <w:sz w:val="18"/>
                 <w:szCs w:val="18"/>
               </w:rPr>
-              <w:t>accuracy=0.87</w:t>
-            </w:r>
-            <w:r>
-              <w:rPr>
-                <w:sz w:val="18"/>
-                <w:szCs w:val="18"/>
-              </w:rPr>
-              <w:t>0</w:t>
-            </w:r>
-            <w:r>
-              <w:rPr>
-                <w:sz w:val="18"/>
-                <w:szCs w:val="18"/>
-              </w:rPr>
-              <w:t xml:space="preserve"> precision=0.8</w:t>
-            </w:r>
-            <w:r>
-              <w:rPr>
-                <w:sz w:val="18"/>
-                <w:szCs w:val="18"/>
-              </w:rPr>
-              <w:t>7</w:t>
-            </w:r>
-            <w:r>
-              <w:rPr>
-                <w:sz w:val="18"/>
-                <w:szCs w:val="18"/>
-              </w:rPr>
-              <w:t xml:space="preserve">, recall=0.984, f1=0.929, </w:t>
+              <w:t xml:space="preserve">accuracy=0.871, precision=0.880, recall=0.984, f1=0.929, </w:t>
             </w:r>
             <w:proofErr w:type="spellStart"/>
             <w:r>
@@ -1083,53 +1283,7 @@
                 <w:sz w:val="18"/>
                 <w:szCs w:val="18"/>
               </w:rPr>
-              <w:t>train: 1</w:t>
-            </w:r>
-            <w:r>
-              <w:rPr>
-                <w:sz w:val="18"/>
-                <w:szCs w:val="18"/>
-              </w:rPr>
-              <w:t>9</w:t>
-            </w:r>
-            <w:r>
-              <w:rPr>
-                <w:sz w:val="18"/>
-                <w:szCs w:val="18"/>
-              </w:rPr>
-              <w:t>.</w:t>
-            </w:r>
-            <w:r>
-              <w:rPr>
-                <w:sz w:val="18"/>
-                <w:szCs w:val="18"/>
-              </w:rPr>
-              <w:t>1</w:t>
-            </w:r>
-            <w:r>
-              <w:rPr>
-                <w:sz w:val="18"/>
-                <w:szCs w:val="18"/>
-              </w:rPr>
-              <w:t>s</w:t>
-            </w:r>
-          </w:p>
-          <w:p>
-            <w:r>
-              <w:rPr>
-                <w:sz w:val="18"/>
-                <w:szCs w:val="18"/>
-              </w:rPr>
-              <w:t>rows: 349,999</w:t>
-            </w:r>
-          </w:p>
-          <w:p>
-            <w:r>
-              <w:rPr>
-                <w:sz w:val="18"/>
-                <w:szCs w:val="18"/>
-              </w:rPr>
-              <w:t>25,384 rows/s</w:t>
+              <w:t>train: 13.9s, rows: 349,999, 25,199 rows/s</w:t>
             </w:r>
           </w:p>
         </w:tc>
@@ -1150,13 +1304,6 @@
             </w:tcMar>
           </w:tcPr>
           <w:p>
-            <w:r>
-              <w:rPr>
-                <w:sz w:val="18"/>
-                <w:szCs w:val="18"/>
-              </w:rPr>
-              <w:t xml:space="preserve">Tradeoff: significantly better ROC-AUC (0.795 vs 0.500) and precision (0.880 vs 0.861) than baseline, but slower to train. Default </w:t>
-            </w:r>
             <w:proofErr w:type="spellStart"/>
             <w:r>
               <w:rPr>
@@ -1171,7 +1318,23 @@
                 <w:sz w:val="18"/>
                 <w:szCs w:val="18"/>
               </w:rPr>
-              <w:t xml:space="preserve"> params with no tuning.</w:t>
+              <w:t xml:space="preserve"> with default params. Better throughput than </w:t>
+            </w:r>
+            <w:proofErr w:type="spellStart"/>
+            <w:r>
+              <w:rPr>
+                <w:sz w:val="18"/>
+                <w:szCs w:val="18"/>
+              </w:rPr>
+              <w:t>hist_gradient_boosting</w:t>
+            </w:r>
+            <w:proofErr w:type="spellEnd"/>
+            <w:r>
+              <w:rPr>
+                <w:sz w:val="18"/>
+                <w:szCs w:val="18"/>
+              </w:rPr>
+              <w:t xml:space="preserve"> (25k vs 17k rows/s) with near-identical metrics. Starting point before tuning.</w:t>
             </w:r>
           </w:p>
         </w:tc>
@@ -1183,6 +1346,9 @@
             <w:bottom w:w="0" w:type="dxa"/>
           </w:tblCellMar>
         </w:tblPrEx>
+        <w:trPr>
+          <w:trHeight w:val="361"/>
+        </w:trPr>
         <w:tc>
           <w:tcPr>
             <w:tcW w:w="1162" w:type="dxa"/>
@@ -1230,30 +1396,14 @@
             </w:tcMar>
           </w:tcPr>
           <w:p>
-            <w:hyperlink r:id="rId10" w:anchor="/experiments/1/runs/ba76be0413c94deeb6d21886cfeb40eb" w:history="1">
+            <w:hyperlink r:id="rId11" w:anchor="/experiments/1/runs/fdf805c85d564a6bb0168fa30751b1d3" w:tgtFrame="_blank" w:history="1">
               <w:r>
                 <w:rPr>
                   <w:rStyle w:val="Hyperlink"/>
                   <w:sz w:val="16"/>
                   <w:szCs w:val="16"/>
                 </w:rPr>
-                <w:t>Run L</w:t>
-              </w:r>
-              <w:r>
-                <w:rPr>
-                  <w:rStyle w:val="Hyperlink"/>
-                  <w:sz w:val="16"/>
-                  <w:szCs w:val="16"/>
-                </w:rPr>
-                <w:t>i</w:t>
-              </w:r>
-              <w:r>
-                <w:rPr>
-                  <w:rStyle w:val="Hyperlink"/>
-                  <w:sz w:val="16"/>
-                  <w:szCs w:val="16"/>
-                </w:rPr>
-                <w:t>nk</w:t>
+                <w:t>Run Link</w:t>
               </w:r>
             </w:hyperlink>
           </w:p>
@@ -1505,53 +1655,7 @@
                 <w:sz w:val="18"/>
                 <w:szCs w:val="18"/>
               </w:rPr>
-              <w:t xml:space="preserve">train: </w:t>
-            </w:r>
-            <w:r>
-              <w:rPr>
-                <w:sz w:val="18"/>
-                <w:szCs w:val="18"/>
-              </w:rPr>
-              <w:t>20</w:t>
-            </w:r>
-            <w:r>
-              <w:rPr>
-                <w:sz w:val="18"/>
-                <w:szCs w:val="18"/>
-              </w:rPr>
-              <w:t>.</w:t>
-            </w:r>
-            <w:r>
-              <w:rPr>
-                <w:sz w:val="18"/>
-                <w:szCs w:val="18"/>
-              </w:rPr>
-              <w:t>4</w:t>
-            </w:r>
-            <w:r>
-              <w:rPr>
-                <w:sz w:val="18"/>
-                <w:szCs w:val="18"/>
-              </w:rPr>
-              <w:t>s</w:t>
-            </w:r>
-          </w:p>
-          <w:p>
-            <w:r>
-              <w:rPr>
-                <w:sz w:val="18"/>
-                <w:szCs w:val="18"/>
-              </w:rPr>
-              <w:t>rows: 349,999</w:t>
-            </w:r>
-          </w:p>
-          <w:p>
-            <w:r>
-              <w:rPr>
-                <w:sz w:val="18"/>
-                <w:szCs w:val="18"/>
-              </w:rPr>
-              <w:t>23,287 rows/s</w:t>
+              <w:t>train: 14.9s, rows: 349,999, 23,476 rows/s</w:t>
             </w:r>
           </w:p>
         </w:tc>
@@ -1578,51 +1682,21 @@
                 <w:sz w:val="18"/>
                 <w:szCs w:val="18"/>
               </w:rPr>
-              <w:t xml:space="preserve">Best candidate. Highest ROC-AUC (0.797) and recall (98.8%). Lower learning rate + regularization (subsample, </w:t>
-            </w:r>
-            <w:proofErr w:type="spellStart"/>
-            <w:r>
-              <w:rPr>
-                <w:sz w:val="18"/>
-                <w:szCs w:val="18"/>
-              </w:rPr>
-              <w:t>colsample</w:t>
-            </w:r>
-            <w:proofErr w:type="spellEnd"/>
-            <w:r>
-              <w:rPr>
-                <w:sz w:val="18"/>
-                <w:szCs w:val="18"/>
-              </w:rPr>
-              <w:t xml:space="preserve">, L2) reduces overfitting vs V1. </w:t>
-            </w:r>
-            <w:r>
-              <w:rPr>
-                <w:sz w:val="18"/>
-                <w:szCs w:val="18"/>
-              </w:rPr>
-              <w:t xml:space="preserve">Not much slower </w:t>
-            </w:r>
-            <w:r>
-              <w:rPr>
-                <w:sz w:val="18"/>
-                <w:szCs w:val="18"/>
-              </w:rPr>
-              <w:t>than V1 but better generalization. Next experiment: hyperparameter search with Ray Tune to explore wider parameter space</w:t>
-            </w:r>
-            <w:r>
-              <w:rPr>
-                <w:sz w:val="18"/>
-                <w:szCs w:val="18"/>
-              </w:rPr>
-              <w:t xml:space="preserve"> and </w:t>
-            </w:r>
-            <w:r>
-              <w:rPr>
-                <w:sz w:val="18"/>
-                <w:szCs w:val="18"/>
-              </w:rPr>
-              <w:t xml:space="preserve">fault tolerance. </w:t>
+              <w:t xml:space="preserve">Best candidate. Highest ROC-AUC (0.797) and F1 (0.930). Lower learning rate + regularization improves generalization over V1. </w:t>
+            </w:r>
+            <w:r>
+              <w:rPr>
+                <w:sz w:val="18"/>
+                <w:szCs w:val="18"/>
+              </w:rPr>
+              <w:t>Not much</w:t>
+            </w:r>
+            <w:r>
+              <w:rPr>
+                <w:sz w:val="18"/>
+                <w:szCs w:val="18"/>
+              </w:rPr>
+              <w:t xml:space="preserve"> slower than V1.</w:t>
             </w:r>
           </w:p>
         </w:tc>
@@ -1639,14 +1713,24 @@
     <w:p>
       <w:pPr>
         <w:spacing w:after="120"/>
+        <w:rPr>
+          <w:sz w:val="21"/>
+          <w:szCs w:val="21"/>
+        </w:rPr>
       </w:pPr>
       <w:r>
+        <w:rPr>
+          <w:sz w:val="21"/>
+          <w:szCs w:val="21"/>
+        </w:rPr>
         <w:t xml:space="preserve">Best candidate: </w:t>
       </w:r>
       <w:r>
         <w:rPr>
           <w:b/>
           <w:bCs/>
+          <w:sz w:val="21"/>
+          <w:szCs w:val="21"/>
         </w:rPr>
         <w:t>xgboost_v2</w:t>
       </w:r>
@@ -1654,6 +1738,8 @@
         <w:rPr>
           <w:b/>
           <w:bCs/>
+          <w:sz w:val="21"/>
+          <w:szCs w:val="21"/>
         </w:rPr>
         <w:t>.</w:t>
       </w:r>
@@ -1661,54 +1747,102 @@
     <w:p>
       <w:pPr>
         <w:spacing w:after="120"/>
+        <w:rPr>
+          <w:sz w:val="21"/>
+          <w:szCs w:val="21"/>
+        </w:rPr>
       </w:pPr>
       <w:r>
+        <w:rPr>
+          <w:sz w:val="21"/>
+          <w:szCs w:val="21"/>
+        </w:rPr>
         <w:t xml:space="preserve">xgboost_v2 achieves the highest ROC-AUC (0.797) and recall (98.8%), with regularization techniques (subsample=0.85, </w:t>
       </w:r>
       <w:proofErr w:type="spellStart"/>
       <w:r>
+        <w:rPr>
+          <w:sz w:val="21"/>
+          <w:szCs w:val="21"/>
+        </w:rPr>
         <w:t>colsample_bytree</w:t>
       </w:r>
       <w:proofErr w:type="spellEnd"/>
       <w:r>
+        <w:rPr>
+          <w:sz w:val="21"/>
+          <w:szCs w:val="21"/>
+        </w:rPr>
         <w:t xml:space="preserve">=0.8, </w:t>
       </w:r>
       <w:proofErr w:type="spellStart"/>
       <w:r>
+        <w:rPr>
+          <w:sz w:val="21"/>
+          <w:szCs w:val="21"/>
+        </w:rPr>
         <w:t>reg_lambda</w:t>
       </w:r>
       <w:proofErr w:type="spellEnd"/>
       <w:r>
+        <w:rPr>
+          <w:sz w:val="21"/>
+          <w:szCs w:val="21"/>
+        </w:rPr>
         <w:t>=1.5) that reduce overfitting compared to V1’s default parameters.</w:t>
       </w:r>
     </w:p>
     <w:p>
       <w:pPr>
         <w:spacing w:after="120"/>
+        <w:rPr>
+          <w:sz w:val="21"/>
+          <w:szCs w:val="21"/>
+        </w:rPr>
       </w:pPr>
       <w:r>
+        <w:rPr>
+          <w:sz w:val="21"/>
+          <w:szCs w:val="21"/>
+        </w:rPr>
         <w:t>The baseline (</w:t>
       </w:r>
       <w:proofErr w:type="spellStart"/>
       <w:r>
+        <w:rPr>
+          <w:sz w:val="21"/>
+          <w:szCs w:val="21"/>
+        </w:rPr>
         <w:t>DummyClassifier</w:t>
       </w:r>
       <w:proofErr w:type="spellEnd"/>
       <w:r>
+        <w:rPr>
+          <w:sz w:val="21"/>
+          <w:szCs w:val="21"/>
+        </w:rPr>
         <w:t>) confirms that the dataset is 86.1% positive, making accuracy alone misleading — ROC-AUC is the true discriminative metric.</w:t>
       </w:r>
     </w:p>
     <w:p>
       <w:pPr>
         <w:spacing w:after="200"/>
+        <w:rPr>
+          <w:sz w:val="21"/>
+          <w:szCs w:val="21"/>
+        </w:rPr>
       </w:pPr>
       <w:r>
+        <w:rPr>
+          <w:sz w:val="21"/>
+          <w:szCs w:val="21"/>
+        </w:rPr>
         <w:t>All training was executed on Chameleon Cloud in Docker containers, with 349,999 training rows and 34,999 validation rows (time-based split, cutoff May 2021)</w:t>
       </w:r>
     </w:p>
     <w:sectPr>
-      <w:headerReference w:type="default" r:id="rId11"/>
-      <w:footerReference w:type="default" r:id="rId12"/>
+      <w:headerReference w:type="default" r:id="rId12"/>
+      <w:footerReference w:type="default" r:id="rId13"/>
       <w:pgSz w:w="15840" w:h="12240" w:orient="landscape"/>
       <w:pgMar w:top="1008" w:right="1008" w:bottom="1008" w:left="1008" w:header="708" w:footer="708" w:gutter="0"/>
       <w:cols w:space="720"/>

</xml_diff>

<commit_message>
final update in pdf
</commit_message>
<xml_diff>
--- a/docs/gemspot_training_report_newip.docx
+++ b/docs/gemspot_training_report_newip.docx
@@ -782,6 +782,13 @@
                 <w:szCs w:val="18"/>
               </w:rPr>
             </w:pPr>
+            <w:r>
+              <w:rPr>
+                <w:sz w:val="18"/>
+                <w:szCs w:val="18"/>
+              </w:rPr>
+              <w:t>0</w:t>
+            </w:r>
           </w:p>
         </w:tc>
         <w:tc>

</xml_diff>